<commit_message>
Apply RaSpect branding, VTC cover page, footer logo/rights, page numbers, and pricing table fixes
</commit_message>
<xml_diff>
--- a/Proposals/VTC-HK_Inspectica_Training_Proposal.docx
+++ b/Proposals/VTC-HK_Inspectica_Training_Proposal.docx
@@ -689,60 +689,279 @@
         <w:t xml:space="preserve">Pricing (Hong Kong Dollars)</w:t>
       </w:r>
     </w:p>
-    <w:p>
-      <w:pPr>
-        <w:pStyle w:val="FirstParagraph"/>
-      </w:pPr>
-      <w:r>
-        <w:t xml:space="preserve">Itemised:</w:t>
-      </w:r>
-      <w:r>
-        <w:t xml:space="preserve"> </w:t>
-      </w:r>
-      <w:r>
-        <w:t xml:space="preserve">- Course preparation &amp; custom dataset: HKD 6,000</w:t>
-      </w:r>
-      <w:r>
-        <w:t xml:space="preserve"> </w:t>
-      </w:r>
-      <w:r>
-        <w:t xml:space="preserve">- Delivery (5×3h) — instructor fees &amp; trainer time: HKD 25,000</w:t>
-      </w:r>
-      <w:r>
-        <w:t xml:space="preserve"> </w:t>
-      </w:r>
-      <w:r>
-        <w:t xml:space="preserve">- Materials production (slide decks, lab guides): HKD 2,500</w:t>
-      </w:r>
-      <w:r>
-        <w:t xml:space="preserve"> </w:t>
-      </w:r>
-      <w:r>
-        <w:t xml:space="preserve">- Demo Inspectica access / licensing &amp; technical setup: HKD 4,000</w:t>
-      </w:r>
-      <w:r>
-        <w:t xml:space="preserve"> </w:t>
-      </w:r>
-      <w:r>
-        <w:t xml:space="preserve">- Travel &amp; incidental expenses (if in-person): HKD 2,500</w:t>
-      </w:r>
-      <w:r>
-        <w:t xml:space="preserve"> </w:t>
-      </w:r>
-      <w:r>
-        <w:t xml:space="preserve">—</w:t>
-      </w:r>
-      <w:r>
-        <w:t xml:space="preserve"> </w:t>
-      </w:r>
-      <w:r>
-        <w:rPr>
-          <w:b/>
-          <w:bCs/>
-        </w:rPr>
-        <w:t xml:space="preserve">Total (excl. VAT): HKD 40,000</w:t>
-      </w:r>
-    </w:p>
+    <w:tbl>
+      <w:tblPr>
+        <w:tblStyle w:val="Table"/>
+        <w:tblW w:type="pct" w:w="5000"/>
+        <w:tblLayout w:type="fixed"/>
+        <w:tblLook w:firstRow="1" w:lastRow="0" w:firstColumn="0" w:lastColumn="0" w:noHBand="0" w:noVBand="0" w:val="0020"/>
+      </w:tblPr>
+      <w:tblGrid>
+        <w:gridCol w:w="2376"/>
+        <w:gridCol w:w="2376"/>
+        <w:gridCol w:w="3168"/>
+      </w:tblGrid>
+      <w:tr>
+        <w:trPr>
+          <w:tblHeader w:val="on"/>
+        </w:trPr>
+        <w:tc>
+          <w:tcPr/>
+          <w:p>
+            <w:pPr>
+              <w:pStyle w:val="Compact"/>
+            </w:pPr>
+            <w:r>
+              <w:t xml:space="preserve">Item</w:t>
+            </w:r>
+          </w:p>
+        </w:tc>
+        <w:tc>
+          <w:tcPr/>
+          <w:p>
+            <w:pPr>
+              <w:pStyle w:val="Compact"/>
+            </w:pPr>
+            <w:r>
+              <w:t xml:space="preserve">Description</w:t>
+            </w:r>
+          </w:p>
+        </w:tc>
+        <w:tc>
+          <w:tcPr/>
+          <w:p>
+            <w:pPr>
+              <w:pStyle w:val="Compact"/>
+              <w:jc w:val="right"/>
+            </w:pPr>
+            <w:r>
+              <w:t xml:space="preserve">Amount (HKD)</w:t>
+            </w:r>
+          </w:p>
+        </w:tc>
+      </w:tr>
+      <w:tr>
+        <w:tc>
+          <w:tcPr/>
+          <w:p>
+            <w:pPr>
+              <w:pStyle w:val="Compact"/>
+            </w:pPr>
+            <w:r>
+              <w:t xml:space="preserve">1</w:t>
+            </w:r>
+          </w:p>
+        </w:tc>
+        <w:tc>
+          <w:tcPr/>
+          <w:p>
+            <w:pPr>
+              <w:pStyle w:val="Compact"/>
+            </w:pPr>
+            <w:r>
+              <w:t xml:space="preserve">Course preparation and VTC-custom dataset</w:t>
+            </w:r>
+          </w:p>
+        </w:tc>
+        <w:tc>
+          <w:tcPr/>
+          <w:p>
+            <w:pPr>
+              <w:pStyle w:val="Compact"/>
+              <w:jc w:val="right"/>
+            </w:pPr>
+            <w:r>
+              <w:t xml:space="preserve">6,000</w:t>
+            </w:r>
+          </w:p>
+        </w:tc>
+      </w:tr>
+      <w:tr>
+        <w:tc>
+          <w:tcPr/>
+          <w:p>
+            <w:pPr>
+              <w:pStyle w:val="Compact"/>
+            </w:pPr>
+            <w:r>
+              <w:t xml:space="preserve">2</w:t>
+            </w:r>
+          </w:p>
+        </w:tc>
+        <w:tc>
+          <w:tcPr/>
+          <w:p>
+            <w:pPr>
+              <w:pStyle w:val="Compact"/>
+            </w:pPr>
+            <w:r>
+              <w:t xml:space="preserve">Delivery (5 × 3h), lead trainer and technical lab support</w:t>
+            </w:r>
+          </w:p>
+        </w:tc>
+        <w:tc>
+          <w:tcPr/>
+          <w:p>
+            <w:pPr>
+              <w:pStyle w:val="Compact"/>
+              <w:jc w:val="right"/>
+            </w:pPr>
+            <w:r>
+              <w:t xml:space="preserve">25,000</w:t>
+            </w:r>
+          </w:p>
+        </w:tc>
+      </w:tr>
+      <w:tr>
+        <w:tc>
+          <w:tcPr/>
+          <w:p>
+            <w:pPr>
+              <w:pStyle w:val="Compact"/>
+            </w:pPr>
+            <w:r>
+              <w:t xml:space="preserve">3</w:t>
+            </w:r>
+          </w:p>
+        </w:tc>
+        <w:tc>
+          <w:tcPr/>
+          <w:p>
+            <w:pPr>
+              <w:pStyle w:val="Compact"/>
+            </w:pPr>
+            <w:r>
+              <w:t xml:space="preserve">Materials production (slides and lab guides)</w:t>
+            </w:r>
+          </w:p>
+        </w:tc>
+        <w:tc>
+          <w:tcPr/>
+          <w:p>
+            <w:pPr>
+              <w:pStyle w:val="Compact"/>
+              <w:jc w:val="right"/>
+            </w:pPr>
+            <w:r>
+              <w:t xml:space="preserve">2,500</w:t>
+            </w:r>
+          </w:p>
+        </w:tc>
+      </w:tr>
+      <w:tr>
+        <w:tc>
+          <w:tcPr/>
+          <w:p>
+            <w:pPr>
+              <w:pStyle w:val="Compact"/>
+            </w:pPr>
+            <w:r>
+              <w:t xml:space="preserve">4</w:t>
+            </w:r>
+          </w:p>
+        </w:tc>
+        <w:tc>
+          <w:tcPr/>
+          <w:p>
+            <w:pPr>
+              <w:pStyle w:val="Compact"/>
+            </w:pPr>
+            <w:r>
+              <w:t xml:space="preserve">Inspectica demo setup and temporary licensing</w:t>
+            </w:r>
+          </w:p>
+        </w:tc>
+        <w:tc>
+          <w:tcPr/>
+          <w:p>
+            <w:pPr>
+              <w:pStyle w:val="Compact"/>
+              <w:jc w:val="right"/>
+            </w:pPr>
+            <w:r>
+              <w:t xml:space="preserve">4,000</w:t>
+            </w:r>
+          </w:p>
+        </w:tc>
+      </w:tr>
+      <w:tr>
+        <w:tc>
+          <w:tcPr/>
+          <w:p>
+            <w:pPr>
+              <w:pStyle w:val="Compact"/>
+            </w:pPr>
+            <w:r>
+              <w:t xml:space="preserve">5</w:t>
+            </w:r>
+          </w:p>
+        </w:tc>
+        <w:tc>
+          <w:tcPr/>
+          <w:p>
+            <w:pPr>
+              <w:pStyle w:val="Compact"/>
+            </w:pPr>
+            <w:r>
+              <w:t xml:space="preserve">Travel and incidental expenses (in-person delivery)</w:t>
+            </w:r>
+          </w:p>
+        </w:tc>
+        <w:tc>
+          <w:tcPr/>
+          <w:p>
+            <w:pPr>
+              <w:pStyle w:val="Compact"/>
+              <w:jc w:val="right"/>
+            </w:pPr>
+            <w:r>
+              <w:t xml:space="preserve">2,500</w:t>
+            </w:r>
+          </w:p>
+        </w:tc>
+      </w:tr>
+      <w:tr>
+        <w:tc>
+          <w:tcPr/>
+          <w:p>
+            <w:pPr>
+              <w:pStyle w:val="Compact"/>
+            </w:pPr>
+          </w:p>
+        </w:tc>
+        <w:tc>
+          <w:tcPr/>
+          <w:p>
+            <w:pPr>
+              <w:pStyle w:val="Compact"/>
+            </w:pPr>
+            <w:r>
+              <w:rPr>
+                <w:b/>
+                <w:bCs/>
+              </w:rPr>
+              <w:t xml:space="preserve">Total (excl. VAT)</w:t>
+            </w:r>
+          </w:p>
+        </w:tc>
+        <w:tc>
+          <w:tcPr/>
+          <w:p>
+            <w:pPr>
+              <w:pStyle w:val="Compact"/>
+              <w:jc w:val="right"/>
+            </w:pPr>
+            <w:r>
+              <w:rPr>
+                <w:b/>
+                <w:bCs/>
+              </w:rPr>
+              <w:t xml:space="preserve">40,000</w:t>
+            </w:r>
+          </w:p>
+        </w:tc>
+      </w:tr>
+    </w:tbl>
     <w:p>
       <w:pPr>
         <w:pStyle w:val="BodyText"/>

</xml_diff>